<commit_message>
Pushing assessment 1 & 2 and updating 2d platform
</commit_message>
<xml_diff>
--- a/User Story.docx
+++ b/User Story.docx
@@ -5,24 +5,52 @@
     <w:p/>
     <w:p>
       <w:r>
-        <w:t>1. Workout Container (WorkoutManager class)</w:t>
-      </w:r>
-    </w:p>
-    <w:p>
-      <w:r>
-        <w:t>As a user, I want a workout manager that is centralized so I can access and manage all my training session in one place.</w:t>
-      </w:r>
-    </w:p>
+        <w:t>1. Workout Container (</w:t>
+      </w:r>
+      <w:proofErr w:type="spellStart"/>
+      <w:r>
+        <w:t>WorkoutManager</w:t>
+      </w:r>
+      <w:proofErr w:type="spellEnd"/>
+      <w:r>
+        <w:t xml:space="preserve"> class)</w:t>
+      </w:r>
+      <w:r>
+        <w:t xml:space="preserve"> </w:t>
+      </w:r>
+    </w:p>
+    <w:p>
+      <w:r>
+        <w:t xml:space="preserve">As a </w:t>
+      </w:r>
+      <w:r>
+        <w:t>user, a</w:t>
+      </w:r>
+      <w:r>
+        <w:t xml:space="preserve"> centralized workout manager would be helpful so all training sessions can be accessed and managed in one place.</w:t>
+      </w:r>
+    </w:p>
+    <w:p/>
     <w:p>
       <w:r>
         <w:t>2. Add a Workout</w:t>
       </w:r>
-    </w:p>
-    <w:p>
-      <w:r>
-        <w:t>As a user, I want a form that is pre-filled with default values and input validation so I can manage my new training sessions quickly and accurately.</w:t>
-      </w:r>
-    </w:p>
+      <w:r>
+        <w:t xml:space="preserve"> </w:t>
+      </w:r>
+    </w:p>
+    <w:p>
+      <w:r>
+        <w:t xml:space="preserve">As a </w:t>
+      </w:r>
+      <w:r>
+        <w:t>user, I think</w:t>
+      </w:r>
+      <w:r>
+        <w:t xml:space="preserve"> I can manage the new training sessions more easily and accurately with a pre-filled form with default values and input validation.</w:t>
+      </w:r>
+    </w:p>
+    <w:p/>
     <w:p>
       <w:r>
         <w:t>3. Sort Workouts</w:t>
@@ -30,12 +58,10 @@
     </w:p>
     <w:p>
       <w:r>
-        <w:t>As a user, I want an app that can sort based on type, duration, or date so I can organise and review all my workouts efficiently</w:t>
-      </w:r>
-      <w:r>
-        <w:t>.</w:t>
-      </w:r>
-    </w:p>
+        <w:t>As a user, an app that can sort based on type and date would be helpful for easy organization and effective review of all my workouts.</w:t>
+      </w:r>
+    </w:p>
+    <w:p/>
     <w:p>
       <w:pPr>
         <w:rPr>
@@ -51,6 +77,7 @@
         <w:t>As a user, I want to search for or filter workouts based on categories, so that I can find may session easily.</w:t>
       </w:r>
     </w:p>
+    <w:p/>
     <w:p>
       <w:r>
         <w:t>5. Delete a Workout</w:t>
@@ -58,28 +85,50 @@
     </w:p>
     <w:p>
       <w:r>
-        <w:t>As a user, I want to delete my workouts that I no longer need or have finished so that I can see all of my workouts that I needed.</w:t>
-      </w:r>
-    </w:p>
-    <w:p>
-      <w:r>
-        <w:t>6. Save to LocalStorage</w:t>
-      </w:r>
-    </w:p>
-    <w:p>
-      <w:r>
-        <w:t xml:space="preserve"> As a user, I want all my workouts to be saved automatically to LocalStorage, so that my data persists between sessions.</w:t>
+        <w:t>As a user, I want to delete the workouts that I don't need anymore, to be able to see those that I only need</w:t>
+      </w:r>
+      <w:r>
+        <w:t>.</w:t>
       </w:r>
     </w:p>
     <w:p/>
     <w:p>
       <w:r>
+        <w:t xml:space="preserve">6. Save to </w:t>
+      </w:r>
+      <w:r>
+        <w:t>Local Storage</w:t>
+      </w:r>
+    </w:p>
+    <w:p>
+      <w:r>
+        <w:t xml:space="preserve"> </w:t>
+      </w:r>
+      <w:r>
+        <w:t>As a user, I want an automatic Local Storage, so my workouts can be saved between sessions</w:t>
+      </w:r>
+    </w:p>
+    <w:p/>
+    <w:p>
+      <w:r>
         <w:t>7. Load from LocalStorage</w:t>
       </w:r>
     </w:p>
     <w:p>
       <w:r>
-        <w:t>As a user, I want the app to load my saved workouts from LocalStorage when it starts, so that I don’t lose any data.</w:t>
+        <w:t xml:space="preserve">As a </w:t>
+      </w:r>
+      <w:r>
+        <w:t>user, I</w:t>
+      </w:r>
+      <w:r>
+        <w:t xml:space="preserve"> want an app that automatically loads the workouts that I saved from </w:t>
+      </w:r>
+      <w:r>
+        <w:t>the Local</w:t>
+      </w:r>
+      <w:r>
+        <w:t xml:space="preserve"> Storage as soon as it starts to make sure that I don't lose my data.</w:t>
       </w:r>
     </w:p>
     <w:p/>
@@ -90,30 +139,36 @@
     </w:p>
     <w:p>
       <w:r>
-        <w:t>As a user, I want to update the details of an existing workout, so that I can fix mistakes or add missing information.</w:t>
+        <w:t>As a user, I would want to revise or correct any mistakes by updating the details.</w:t>
       </w:r>
     </w:p>
     <w:p/>
     <w:p>
       <w:r>
+        <w:lastRenderedPageBreak/>
         <w:t>9. Revert Changes During Edit</w:t>
       </w:r>
     </w:p>
     <w:p>
       <w:r>
-        <w:t xml:space="preserve"> As a user, I want the ability to cancel changes while editing a workout, so that I don’t accidentally save unwanted edits.</w:t>
+        <w:t xml:space="preserve"> </w:t>
+      </w:r>
+      <w:r>
+        <w:t>As a user, I want to cancel any changes during editing so no unwanted details will be saved.</w:t>
       </w:r>
     </w:p>
     <w:p/>
     <w:p>
       <w:r>
-        <w:lastRenderedPageBreak/>
         <w:t>10. Input Validation</w:t>
       </w:r>
     </w:p>
     <w:p>
       <w:r>
-        <w:t xml:space="preserve"> As a user, I want the app to validate my inputs (e.g., positive numbers for duration), so that I don’t save invalid data.</w:t>
+        <w:t xml:space="preserve"> </w:t>
+      </w:r>
+      <w:r>
+        <w:t>As a user, I want an app that only updates valid data.</w:t>
       </w:r>
     </w:p>
     <w:p/>
@@ -124,7 +179,13 @@
     </w:p>
     <w:p>
       <w:r>
-        <w:t>As a user, I want each workout to calculate average pace (e.g., min/km), so that I can evaluate performance for that session.</w:t>
+        <w:t xml:space="preserve">As a user, I want to evaluate </w:t>
+      </w:r>
+      <w:r>
+        <w:t>the performance</w:t>
+      </w:r>
+      <w:r>
+        <w:t xml:space="preserve"> for the session of each workout be calculated.</w:t>
       </w:r>
     </w:p>
     <w:p/>
@@ -135,7 +196,7 @@
     </w:p>
     <w:p>
       <w:r>
-        <w:t>As a user, I want the app to calculate total distance and duration over all workouts, so that I can track overall progress.</w:t>
+        <w:t>As a user, I want the app to track the overall progress by calculating the total distance and duration of all workouts.</w:t>
       </w:r>
     </w:p>
     <w:p/>
@@ -146,7 +207,7 @@
     </w:p>
     <w:p>
       <w:r>
-        <w:t>As a user, I want the new workout form to include default values (e.g., today’s date, 30 minutes duration), so that I can log workouts faster.</w:t>
+        <w:t>As a user, I want to include the default values to be included in the new workout.</w:t>
       </w:r>
     </w:p>
     <w:p/>
@@ -157,18 +218,21 @@
     </w:p>
     <w:p>
       <w:r>
-        <w:t>As a user, I want a method to get a list of all my workouts, so that I can review my complete training history.</w:t>
+        <w:t>As a user, I think it would be useful to have a system where I can get a list of all my workouts for me to track the training history.</w:t>
       </w:r>
     </w:p>
     <w:p/>
     <w:p>
       <w:r>
-        <w:t>15. CRUD via IndexedDB</w:t>
-      </w:r>
-    </w:p>
-    <w:p>
-      <w:r>
-        <w:t>As a user, I want the option to store workouts in IndexedDB for more scalable storage, so that I can manage larger datasets securely.</w:t>
+        <w:t>15. CRUD via</w:t>
+      </w:r>
+      <w:r>
+        <w:t xml:space="preserve"> Database</w:t>
+      </w:r>
+    </w:p>
+    <w:p>
+      <w:r>
+        <w:t>As a user, I want an adjustable storage to save my workouts, to easily and securely manage larger data sets.</w:t>
       </w:r>
     </w:p>
     <w:p/>
@@ -179,10 +243,15 @@
     </w:p>
     <w:p>
       <w:r>
-        <w:t>As a user, I want the app to handle errors (e.g., empty inputs, bad data, storage failures) gracefully, so that the app doesn’t crash or lose data.</w:t>
-      </w:r>
-    </w:p>
-    <w:p/>
+        <w:t xml:space="preserve">As a user, I want an app that can handle errors </w:t>
+      </w:r>
+      <w:r>
+        <w:t>effectively and</w:t>
+      </w:r>
+      <w:r>
+        <w:t xml:space="preserve"> must not crash and lose the data.</w:t>
+      </w:r>
+    </w:p>
     <w:sectPr>
       <w:pgSz w:w="12240" w:h="15840"/>
       <w:pgMar w:top="1440" w:right="1440" w:bottom="1440" w:left="1440" w:header="708" w:footer="708" w:gutter="0"/>
@@ -191,6 +260,127 @@
     </w:sectPr>
   </w:body>
 </w:document>
+</file>
+
+<file path=word/numbering.xml><?xml version="1.0" encoding="utf-8"?>
+<w:numbering xmlns:wpc="http://schemas.microsoft.com/office/word/2010/wordprocessingCanvas" xmlns:cx="http://schemas.microsoft.com/office/drawing/2014/chartex" xmlns:cx1="http://schemas.microsoft.com/office/drawing/2015/9/8/chartex" xmlns:cx2="http://schemas.microsoft.com/office/drawing/2015/10/21/chartex" xmlns:cx3="http://schemas.microsoft.com/office/drawing/2016/5/9/chartex" xmlns:cx4="http://schemas.microsoft.com/office/drawing/2016/5/10/chartex" xmlns:cx5="http://schemas.microsoft.com/office/drawing/2016/5/11/chartex" xmlns:cx6="http://schemas.microsoft.com/office/drawing/2016/5/12/chartex" xmlns:cx7="http://schemas.microsoft.com/office/drawing/2016/5/13/chartex" xmlns:cx8="http://schemas.microsoft.com/office/drawing/2016/5/14/chartex" xmlns:mc="http://schemas.openxmlformats.org/markup-compatibility/2006" xmlns:aink="http://schemas.microsoft.com/office/drawing/2016/ink" xmlns:am3d="http://schemas.microsoft.com/office/drawing/2017/model3d" xmlns:o="urn:schemas-microsoft-com:office:office" xmlns:oel="http://schemas.microsoft.com/office/2019/extlst" xmlns:r="http://schemas.openxmlformats.org/officeDocument/2006/relationships" xmlns:m="http://schemas.openxmlformats.org/officeDocument/2006/math" xmlns:v="urn:schemas-microsoft-com:vml" xmlns:wp14="http://schemas.microsoft.com/office/word/2010/wordprocessingDrawing" xmlns:wp="http://schemas.openxmlformats.org/drawingml/2006/wordprocessingDrawing" xmlns:w10="urn:schemas-microsoft-com:office:word" xmlns:w="http://schemas.openxmlformats.org/wordprocessingml/2006/main" xmlns:w14="http://schemas.microsoft.com/office/word/2010/wordml" xmlns:w15="http://schemas.microsoft.com/office/word/2012/wordml" xmlns:w16cex="http://schemas.microsoft.com/office/word/2018/wordml/cex" xmlns:w16cid="http://schemas.microsoft.com/office/word/2016/wordml/cid" xmlns:w16="http://schemas.microsoft.com/office/word/2018/wordml" xmlns:w16du="http://schemas.microsoft.com/office/word/2023/wordml/word16du" xmlns:w16sdtdh="http://schemas.microsoft.com/office/word/2020/wordml/sdtdatahash" xmlns:w16sdtfl="http://schemas.microsoft.com/office/word/2024/wordml/sdtformatlock" xmlns:w16se="http://schemas.microsoft.com/office/word/2015/wordml/symex" xmlns:wpg="http://schemas.microsoft.com/office/word/2010/wordprocessingGroup" xmlns:wpi="http://schemas.microsoft.com/office/word/2010/wordprocessingInk" xmlns:wne="http://schemas.microsoft.com/office/word/2006/wordml" xmlns:wps="http://schemas.microsoft.com/office/word/2010/wordprocessingShape" mc:Ignorable="w14 w15 w16se w16cid w16 w16cex w16sdtdh w16sdtfl w16du wp14">
+  <w:abstractNum w:abstractNumId="0" w15:restartNumberingAfterBreak="0">
+    <w:nsid w:val="30CA6F8A"/>
+    <w:multiLevelType w:val="multilevel"/>
+    <w:tmpl w:val="7C8A4E7C"/>
+    <w:lvl w:ilvl="0">
+      <w:start w:val="2"/>
+      <w:numFmt w:val="decimal"/>
+      <w:lvlText w:val="%1."/>
+      <w:lvlJc w:val="left"/>
+      <w:pPr>
+        <w:tabs>
+          <w:tab w:val="num" w:pos="720"/>
+        </w:tabs>
+        <w:ind w:left="720" w:hanging="360"/>
+      </w:pPr>
+    </w:lvl>
+    <w:lvl w:ilvl="1" w:tentative="1">
+      <w:start w:val="1"/>
+      <w:numFmt w:val="decimal"/>
+      <w:lvlText w:val="%2."/>
+      <w:lvlJc w:val="left"/>
+      <w:pPr>
+        <w:tabs>
+          <w:tab w:val="num" w:pos="1440"/>
+        </w:tabs>
+        <w:ind w:left="1440" w:hanging="360"/>
+      </w:pPr>
+    </w:lvl>
+    <w:lvl w:ilvl="2" w:tentative="1">
+      <w:start w:val="1"/>
+      <w:numFmt w:val="decimal"/>
+      <w:lvlText w:val="%3."/>
+      <w:lvlJc w:val="left"/>
+      <w:pPr>
+        <w:tabs>
+          <w:tab w:val="num" w:pos="2160"/>
+        </w:tabs>
+        <w:ind w:left="2160" w:hanging="360"/>
+      </w:pPr>
+    </w:lvl>
+    <w:lvl w:ilvl="3" w:tentative="1">
+      <w:start w:val="1"/>
+      <w:numFmt w:val="decimal"/>
+      <w:lvlText w:val="%4."/>
+      <w:lvlJc w:val="left"/>
+      <w:pPr>
+        <w:tabs>
+          <w:tab w:val="num" w:pos="2880"/>
+        </w:tabs>
+        <w:ind w:left="2880" w:hanging="360"/>
+      </w:pPr>
+    </w:lvl>
+    <w:lvl w:ilvl="4" w:tentative="1">
+      <w:start w:val="1"/>
+      <w:numFmt w:val="decimal"/>
+      <w:lvlText w:val="%5."/>
+      <w:lvlJc w:val="left"/>
+      <w:pPr>
+        <w:tabs>
+          <w:tab w:val="num" w:pos="3600"/>
+        </w:tabs>
+        <w:ind w:left="3600" w:hanging="360"/>
+      </w:pPr>
+    </w:lvl>
+    <w:lvl w:ilvl="5" w:tentative="1">
+      <w:start w:val="1"/>
+      <w:numFmt w:val="decimal"/>
+      <w:lvlText w:val="%6."/>
+      <w:lvlJc w:val="left"/>
+      <w:pPr>
+        <w:tabs>
+          <w:tab w:val="num" w:pos="4320"/>
+        </w:tabs>
+        <w:ind w:left="4320" w:hanging="360"/>
+      </w:pPr>
+    </w:lvl>
+    <w:lvl w:ilvl="6" w:tentative="1">
+      <w:start w:val="1"/>
+      <w:numFmt w:val="decimal"/>
+      <w:lvlText w:val="%7."/>
+      <w:lvlJc w:val="left"/>
+      <w:pPr>
+        <w:tabs>
+          <w:tab w:val="num" w:pos="5040"/>
+        </w:tabs>
+        <w:ind w:left="5040" w:hanging="360"/>
+      </w:pPr>
+    </w:lvl>
+    <w:lvl w:ilvl="7" w:tentative="1">
+      <w:start w:val="1"/>
+      <w:numFmt w:val="decimal"/>
+      <w:lvlText w:val="%8."/>
+      <w:lvlJc w:val="left"/>
+      <w:pPr>
+        <w:tabs>
+          <w:tab w:val="num" w:pos="5760"/>
+        </w:tabs>
+        <w:ind w:left="5760" w:hanging="360"/>
+      </w:pPr>
+    </w:lvl>
+    <w:lvl w:ilvl="8" w:tentative="1">
+      <w:start w:val="1"/>
+      <w:numFmt w:val="decimal"/>
+      <w:lvlText w:val="%9."/>
+      <w:lvlJc w:val="left"/>
+      <w:pPr>
+        <w:tabs>
+          <w:tab w:val="num" w:pos="6480"/>
+        </w:tabs>
+        <w:ind w:left="6480" w:hanging="360"/>
+      </w:pPr>
+    </w:lvl>
+  </w:abstractNum>
+  <w:num w:numId="1" w16cid:durableId="492065482">
+    <w:abstractNumId w:val="0"/>
+  </w:num>
+</w:numbering>
 </file>
 
 <file path=word/styles.xml><?xml version="1.0" encoding="utf-8"?>

</xml_diff>